<commit_message>
fix: the renamed in-plant template now merges fully — dean, period, months
The in-use inplant-agreement-template.docx (the former -new variant) used
an unrecognized ${dean_name} and hardcoded "August 2026"; worse,
${months_count}/${training_start}/${training_end} had never existed in the
merge, so the agreement printed blanks there. All are now derived from the
intern's own OJT set: dean from Settings (${college_dean}), start month
from the enrollment, and duration/end month from target hours at ~150
logged hours per month (500h semester = 3 months, 300h summer = 2).
331 tests passing.
</commit_message>
<xml_diff>
--- a/public/documents/templates/cas/inplant-agreement-template.docx
+++ b/public/documents/templates/cas/inplant-agreement-template.docx
@@ -87,6 +87,14 @@
           <w:rFonts w:ascii="Arial Narrow" w:hAnsi="Arial Narrow"/>
           <w:color w:val="000000" w:themeColor="text1"/>
           <w:sz w:val="20"/>
+        </w:rPr>
+        <w:tab/>
+      </w:r>
+      <w:r>
+        <w:rPr>
+          <w:rFonts w:ascii="Arial Narrow" w:hAnsi="Arial Narrow"/>
+          <w:color w:val="000000" w:themeColor="text1"/>
+          <w:sz w:val="20"/>
           <w:u w:val="single"/>
         </w:rPr>
         <w:t>${date_today}</w:t>
@@ -230,42 +238,6 @@
           <w:u w:val="single"/>
         </w:rPr>
         <w:t>${cooperating_agency}</w:t>
-      </w:r>
-      <w:r>
-        <w:rPr>
-          <w:rFonts w:ascii="Arial Narrow" w:hAnsi="Arial Narrow" w:cs="Times New Roman"/>
-          <w:color w:val="000000" w:themeColor="text1"/>
-          <w:sz w:val="20"/>
-          <w:u w:val="single"/>
-        </w:rPr>
-        <w:t xml:space="preserve"> System </w:t>
-      </w:r>
-      <w:r>
-        <w:rPr>
-          <w:rFonts w:ascii="Arial Narrow" w:hAnsi="Arial Narrow" w:cs="Times New Roman"/>
-          <w:color w:val="000000" w:themeColor="text1"/>
-          <w:sz w:val="20"/>
-          <w:u w:val="single"/>
-        </w:rPr>
-        <w:t>Office</w:t>
-      </w:r>
-      <w:r>
-        <w:rPr>
-          <w:rFonts w:ascii="Arial Narrow" w:hAnsi="Arial Narrow" w:cs="Times New Roman"/>
-          <w:color w:val="000000" w:themeColor="text1"/>
-          <w:sz w:val="20"/>
-          <w:u w:val="single"/>
-        </w:rPr>
-        <w:t xml:space="preserve"> </w:t>
-      </w:r>
-      <w:r>
-        <w:rPr>
-          <w:rFonts w:ascii="Arial Narrow" w:hAnsi="Arial Narrow" w:cs="Times New Roman"/>
-          <w:color w:val="000000" w:themeColor="text1"/>
-          <w:sz w:val="20"/>
-          <w:u w:val="single"/>
-        </w:rPr>
-        <w:t>(NORSU-BSC)</w:t>
       </w:r>
       <w:r>
         <w:rPr>
@@ -388,7 +360,16 @@
           <w:szCs w:val="20"/>
           <w:u w:val="single"/>
         </w:rPr>
-        <w:t>${months_count}</w:t>
+        <w:t xml:space="preserve">${months_count} </w:t>
+      </w:r>
+      <w:r>
+        <w:rPr>
+          <w:rFonts w:ascii="Arial Narrow" w:hAnsi="Arial Narrow"/>
+          <w:color w:val="000000" w:themeColor="text1"/>
+          <w:sz w:val="18"/>
+          <w:szCs w:val="20"/>
+        </w:rPr>
+        <w:t xml:space="preserve">months, with a minimum of </w:t>
       </w:r>
       <w:r>
         <w:rPr>
@@ -398,35 +379,25 @@
           <w:szCs w:val="20"/>
           <w:u w:val="single"/>
         </w:rPr>
-        <w:t xml:space="preserve"> </w:t>
-      </w:r>
-      <w:r>
-        <w:rPr>
-          <w:rFonts w:ascii="Arial Narrow" w:hAnsi="Arial Narrow"/>
-          <w:color w:val="000000" w:themeColor="text1"/>
-          <w:sz w:val="18"/>
-          <w:szCs w:val="20"/>
-        </w:rPr>
-        <w:t xml:space="preserve">months, with a minimum of </w:t>
-      </w:r>
-      <w:r>
-        <w:rPr>
-          <w:rFonts w:ascii="Arial Narrow" w:hAnsi="Arial Narrow"/>
-          <w:color w:val="000000" w:themeColor="text1"/>
-          <w:sz w:val="18"/>
-          <w:szCs w:val="20"/>
-          <w:u w:val="single"/>
-        </w:rPr>
-        <w:t>${target_hours}</w:t>
-      </w:r>
-      <w:r>
-        <w:rPr>
-          <w:rFonts w:ascii="Arial Narrow" w:hAnsi="Arial Narrow"/>
-          <w:color w:val="000000" w:themeColor="text1"/>
-          <w:sz w:val="18"/>
-          <w:szCs w:val="20"/>
-        </w:rPr>
-        <w:t xml:space="preserve"> hours as an academic requirement;</w:t>
+        <w:t xml:space="preserve">${target_hours} </w:t>
+      </w:r>
+      <w:r>
+        <w:rPr>
+          <w:rFonts w:ascii="Arial Narrow" w:hAnsi="Arial Narrow"/>
+          <w:color w:val="000000" w:themeColor="text1"/>
+          <w:sz w:val="18"/>
+          <w:szCs w:val="20"/>
+        </w:rPr>
+        <w:t>hours</w:t>
+      </w:r>
+      <w:r>
+        <w:rPr>
+          <w:rFonts w:ascii="Arial Narrow" w:hAnsi="Arial Narrow"/>
+          <w:color w:val="000000" w:themeColor="text1"/>
+          <w:sz w:val="18"/>
+          <w:szCs w:val="20"/>
+        </w:rPr>
+        <w:t xml:space="preserve"> as an academic requirement;</w:t>
       </w:r>
     </w:p>
     <w:p>
@@ -474,7 +445,7 @@
           <w:sz w:val="18"/>
           <w:szCs w:val="18"/>
         </w:rPr>
-        <w:t xml:space="preserve">The training period begins on first week of </w:t>
+        <w:t xml:space="preserve">The training period begins on first week of ${training_start}</w:t>
       </w:r>
       <w:r>
         <w:rPr>
@@ -484,7 +455,27 @@
           <w:szCs w:val="18"/>
           <w:u w:val="single"/>
         </w:rPr>
-        <w:t>${training_start}</w:t>
+        <w:t/>
+      </w:r>
+      <w:r>
+        <w:rPr>
+          <w:rFonts w:ascii="Arial Narrow" w:hAnsi="Arial Narrow"/>
+          <w:color w:val="000000"/>
+          <w:sz w:val="18"/>
+          <w:szCs w:val="18"/>
+          <w:u w:val="single"/>
+        </w:rPr>
+        <w:t xml:space="preserve"/>
+      </w:r>
+      <w:r>
+        <w:rPr>
+          <w:rFonts w:ascii="Arial Narrow" w:hAnsi="Arial Narrow"/>
+          <w:color w:val="000000"/>
+          <w:sz w:val="18"/>
+          <w:szCs w:val="18"/>
+          <w:u w:val="single"/>
+        </w:rPr>
+        <w:t/>
       </w:r>
       <w:r>
         <w:rPr>
@@ -1101,7 +1092,35 @@
           <w:sz w:val="18"/>
           <w:szCs w:val="20"/>
         </w:rPr>
-        <w:t xml:space="preserve">         </w:t>
+        <w:t xml:space="preserve">       </w:t>
+      </w:r>
+      <w:r>
+        <w:rPr>
+          <w:rFonts w:ascii="Arial Narrow" w:hAnsi="Arial Narrow"/>
+          <w:color w:val="000000" w:themeColor="text1"/>
+          <w:sz w:val="18"/>
+          <w:szCs w:val="20"/>
+        </w:rPr>
+        <w:t xml:space="preserve">                   </w:t>
+      </w:r>
+      <w:r>
+        <w:rPr>
+          <w:rFonts w:ascii="Arial Narrow" w:hAnsi="Arial Narrow"/>
+          <w:color w:val="000000" w:themeColor="text1"/>
+          <w:sz w:val="18"/>
+          <w:szCs w:val="20"/>
+        </w:rPr>
+        <w:t xml:space="preserve">  </w:t>
+      </w:r>
+      <w:r>
+        <w:rPr>
+          <w:rFonts w:ascii="Arial Narrow" w:hAnsi="Arial Narrow"/>
+          <w:color w:val="000000" w:themeColor="text1"/>
+          <w:sz w:val="18"/>
+          <w:szCs w:val="20"/>
+          <w:u w:val="single"/>
+        </w:rPr>
+        <w:t>${parent_name}</w:t>
       </w:r>
     </w:p>
     <w:p>
@@ -1311,51 +1330,7 @@
           <w:szCs w:val="20"/>
           <w:u w:val="single"/>
         </w:rPr>
-        <w:t>${parent_name}</w:t>
-      </w:r>
-      <w:r>
-        <w:rPr>
-          <w:rFonts w:ascii="Arial Narrow" w:hAnsi="Arial Narrow"/>
-          <w:b/>
-          <w:color w:val="000000" w:themeColor="text1"/>
-          <w:sz w:val="18"/>
-          <w:szCs w:val="20"/>
-          <w:u w:val="single"/>
-        </w:rPr>
-        <w:t xml:space="preserve"> R.</w:t>
-      </w:r>
-      <w:r>
-        <w:rPr>
-          <w:rFonts w:ascii="Arial Narrow" w:hAnsi="Arial Narrow"/>
-          <w:b/>
-          <w:color w:val="000000" w:themeColor="text1"/>
-          <w:sz w:val="18"/>
-          <w:szCs w:val="20"/>
-          <w:u w:val="single"/>
-        </w:rPr>
-        <w:t xml:space="preserve"> E</w:t>
-      </w:r>
-      <w:r>
-        <w:rPr>
-          <w:rFonts w:ascii="Arial Narrow" w:hAnsi="Arial Narrow"/>
-          <w:b/>
-          <w:color w:val="000000" w:themeColor="text1"/>
-          <w:sz w:val="18"/>
-          <w:szCs w:val="20"/>
-          <w:u w:val="single"/>
-        </w:rPr>
-        <w:t>SP</w:t>
-      </w:r>
-      <w:r>
-        <w:rPr>
-          <w:rFonts w:ascii="Arial Narrow" w:hAnsi="Arial Narrow"/>
-          <w:b/>
-          <w:color w:val="000000" w:themeColor="text1"/>
-          <w:sz w:val="18"/>
-          <w:szCs w:val="20"/>
-          <w:u w:val="single"/>
-        </w:rPr>
-        <w:t>ARCIA, Ph.D.</w:t>
+        <w:t>${college_dean}</w:t>
       </w:r>
     </w:p>
     <w:p>
@@ -2579,7 +2554,7 @@
             </wp:anchor>
           </w:drawing>
         </mc:Choice>
-        <mc:Fallback xmlns:w16sdtfl="http://schemas.microsoft.com/office/word/2024/wordml/sdtformatlock">
+        <mc:Fallback>
           <w:pict>
             <v:shapetype w14:anchorId="05A9033E" id="_x0000_t202" coordsize="21600,21600" o:spt="202" path="m,l,21600r21600,l21600,xe">
               <v:stroke joinstyle="miter"/>

</xml_diff>